<commit_message>
implement year, scenario, location and match column names to deliverable definitions
</commit_message>
<xml_diff>
--- a/doc/User guide.docx
+++ b/doc/User guide.docx
@@ -1,6 +1,6 @@
 
 <file path=word/document.xml><?xml version="1.0" encoding="utf-8"?>
-<w:document xmlns:wpc="http://schemas.microsoft.com/office/word/2010/wordprocessingCanvas" xmlns:cx="http://schemas.microsoft.com/office/drawing/2014/chartex" xmlns:cx1="http://schemas.microsoft.com/office/drawing/2015/9/8/chartex" xmlns:cx2="http://schemas.microsoft.com/office/drawing/2015/10/21/chartex" xmlns:cx3="http://schemas.microsoft.com/office/drawing/2016/5/9/chartex" xmlns:cx4="http://schemas.microsoft.com/office/drawing/2016/5/10/chartex" xmlns:cx5="http://schemas.microsoft.com/office/drawing/2016/5/11/chartex" xmlns:cx6="http://schemas.microsoft.com/office/drawing/2016/5/12/chartex" xmlns:cx7="http://schemas.microsoft.com/office/drawing/2016/5/13/chartex" xmlns:cx8="http://schemas.microsoft.com/office/drawing/2016/5/14/chartex" xmlns:mc="http://schemas.openxmlformats.org/markup-compatibility/2006" xmlns:aink="http://schemas.microsoft.com/office/drawing/2016/ink" xmlns:am3d="http://schemas.microsoft.com/office/drawing/2017/model3d" xmlns:o="urn:schemas-microsoft-com:office:office" xmlns:r="http://schemas.openxmlformats.org/officeDocument/2006/relationships" xmlns:m="http://schemas.openxmlformats.org/officeDocument/2006/math" xmlns:v="urn:schemas-microsoft-com:vml" xmlns:wp14="http://schemas.microsoft.com/office/word/2010/wordprocessingDrawing" xmlns:wp="http://schemas.openxmlformats.org/drawingml/2006/wordprocessingDrawing" xmlns:w10="urn:schemas-microsoft-com:office:word" xmlns:w="http://schemas.openxmlformats.org/wordprocessingml/2006/main" xmlns:w14="http://schemas.microsoft.com/office/word/2010/wordml" xmlns:w15="http://schemas.microsoft.com/office/word/2012/wordml" xmlns:w16cid="http://schemas.microsoft.com/office/word/2016/wordml/cid" xmlns:w16se="http://schemas.microsoft.com/office/word/2015/wordml/symex" xmlns:wpg="http://schemas.microsoft.com/office/word/2010/wordprocessingGroup" xmlns:wpi="http://schemas.microsoft.com/office/word/2010/wordprocessingInk" xmlns:wne="http://schemas.microsoft.com/office/word/2006/wordml" xmlns:wps="http://schemas.microsoft.com/office/word/2010/wordprocessingShape" mc:Ignorable="w14 w15 w16se w16cid wp14">
+<w:document xmlns:wpc="http://schemas.microsoft.com/office/word/2010/wordprocessingCanvas" xmlns:cx="http://schemas.microsoft.com/office/drawing/2014/chartex" xmlns:cx1="http://schemas.microsoft.com/office/drawing/2015/9/8/chartex" xmlns:cx2="http://schemas.microsoft.com/office/drawing/2015/10/21/chartex" xmlns:cx3="http://schemas.microsoft.com/office/drawing/2016/5/9/chartex" xmlns:cx4="http://schemas.microsoft.com/office/drawing/2016/5/10/chartex" xmlns:cx5="http://schemas.microsoft.com/office/drawing/2016/5/11/chartex" xmlns:cx6="http://schemas.microsoft.com/office/drawing/2016/5/12/chartex" xmlns:cx7="http://schemas.microsoft.com/office/drawing/2016/5/13/chartex" xmlns:cx8="http://schemas.microsoft.com/office/drawing/2016/5/14/chartex" xmlns:mc="http://schemas.openxmlformats.org/markup-compatibility/2006" xmlns:aink="http://schemas.microsoft.com/office/drawing/2016/ink" xmlns:am3d="http://schemas.microsoft.com/office/drawing/2017/model3d" xmlns:o="urn:schemas-microsoft-com:office:office" xmlns:oel="http://schemas.microsoft.com/office/2019/extlst" xmlns:r="http://schemas.openxmlformats.org/officeDocument/2006/relationships" xmlns:m="http://schemas.openxmlformats.org/officeDocument/2006/math" xmlns:v="urn:schemas-microsoft-com:vml" xmlns:wp14="http://schemas.microsoft.com/office/word/2010/wordprocessingDrawing" xmlns:wp="http://schemas.openxmlformats.org/drawingml/2006/wordprocessingDrawing" xmlns:w10="urn:schemas-microsoft-com:office:word" xmlns:w="http://schemas.openxmlformats.org/wordprocessingml/2006/main" xmlns:w14="http://schemas.microsoft.com/office/word/2010/wordml" xmlns:w15="http://schemas.microsoft.com/office/word/2012/wordml" xmlns:w16cex="http://schemas.microsoft.com/office/word/2018/wordml/cex" xmlns:w16cid="http://schemas.microsoft.com/office/word/2016/wordml/cid" xmlns:w16="http://schemas.microsoft.com/office/word/2018/wordml" xmlns:w16du="http://schemas.microsoft.com/office/word/2023/wordml/word16du" xmlns:w16sdtdh="http://schemas.microsoft.com/office/word/2020/wordml/sdtdatahash" xmlns:w16se="http://schemas.microsoft.com/office/word/2015/wordml/symex" xmlns:wpg="http://schemas.microsoft.com/office/word/2010/wordprocessingGroup" xmlns:wpi="http://schemas.microsoft.com/office/word/2010/wordprocessingInk" xmlns:wne="http://schemas.microsoft.com/office/word/2006/wordml" xmlns:wps="http://schemas.microsoft.com/office/word/2010/wordprocessingShape" mc:Ignorable="w14 w15 w16se w16cid w16 w16cex w16sdtdh w16du wp14">
   <w:body>
     <w:p>
       <w:pPr>
@@ -142,13 +142,37 @@
         <w:rPr>
           <w:lang w:val="en-US"/>
         </w:rPr>
-        <w:t>To use the recovery model to compute flows, four different CSV files must be provided</w:t>
-      </w:r>
-      <w:r>
-        <w:rPr>
-          <w:lang w:val="en-US"/>
-        </w:rPr>
-        <w:t>: compositions, transfer coefficients, inflows and metadata. These must all be served in CSV format within the same folder. Running the model is very simple:</w:t>
+        <w:t xml:space="preserve">To use the recovery model to compute flows, </w:t>
+      </w:r>
+      <w:r>
+        <w:rPr>
+          <w:lang w:val="en-US"/>
+        </w:rPr>
+        <w:t>three</w:t>
+      </w:r>
+      <w:r>
+        <w:rPr>
+          <w:lang w:val="en-US"/>
+        </w:rPr>
+        <w:t xml:space="preserve"> different CSV files must be provided</w:t>
+      </w:r>
+      <w:r>
+        <w:rPr>
+          <w:lang w:val="en-US"/>
+        </w:rPr>
+        <w:t>: compositions, transfer coefficients</w:t>
+      </w:r>
+      <w:r>
+        <w:rPr>
+          <w:lang w:val="en-US"/>
+        </w:rPr>
+        <w:t xml:space="preserve"> and inflows. </w:t>
+      </w:r>
+      <w:r>
+        <w:rPr>
+          <w:lang w:val="en-US"/>
+        </w:rPr>
+        <w:t>These must all be served in CSV format within the same folder. Running the model is very simple:</w:t>
       </w:r>
     </w:p>
     <w:p>
@@ -167,7 +191,21 @@
         <w:rPr>
           <w:lang w:val="en-US"/>
         </w:rPr>
-        <w:t>Collect the compositions, TCs, inflows and metadata files within the same folder, adhering to the file names and column definitions outlined below</w:t>
+        <w:t>Create a folder for your data, and create a sub-folder called ‘</w:t>
+      </w:r>
+      <w:proofErr w:type="spellStart"/>
+      <w:r>
+        <w:rPr>
+          <w:lang w:val="en-US"/>
+        </w:rPr>
+        <w:t>input_data</w:t>
+      </w:r>
+      <w:proofErr w:type="spellEnd"/>
+      <w:r>
+        <w:rPr>
+          <w:lang w:val="en-US"/>
+        </w:rPr>
+        <w:t>’.</w:t>
       </w:r>
     </w:p>
     <w:p>
@@ -186,6 +224,69 @@
         <w:rPr>
           <w:lang w:val="en-US"/>
         </w:rPr>
+        <w:t>Collect the compositions, TCs</w:t>
+      </w:r>
+      <w:r>
+        <w:rPr>
+          <w:lang w:val="en-US"/>
+        </w:rPr>
+        <w:t xml:space="preserve"> and inflows </w:t>
+      </w:r>
+      <w:r>
+        <w:rPr>
+          <w:lang w:val="en-US"/>
+        </w:rPr>
+        <w:t xml:space="preserve">files within the </w:t>
+      </w:r>
+      <w:r>
+        <w:rPr>
+          <w:lang w:val="en-US"/>
+        </w:rPr>
+        <w:t>‘</w:t>
+      </w:r>
+      <w:proofErr w:type="spellStart"/>
+      <w:r>
+        <w:rPr>
+          <w:lang w:val="en-US"/>
+        </w:rPr>
+        <w:t>input_data</w:t>
+      </w:r>
+      <w:proofErr w:type="spellEnd"/>
+      <w:r>
+        <w:rPr>
+          <w:lang w:val="en-US"/>
+        </w:rPr>
+        <w:t>’</w:t>
+      </w:r>
+      <w:r>
+        <w:rPr>
+          <w:lang w:val="en-US"/>
+        </w:rPr>
+        <w:t xml:space="preserve"> folder, adhering to the file names and column definitions outlined below</w:t>
+      </w:r>
+      <w:r>
+        <w:rPr>
+          <w:lang w:val="en-US"/>
+        </w:rPr>
+        <w:t>.</w:t>
+      </w:r>
+    </w:p>
+    <w:p>
+      <w:pPr>
+        <w:pStyle w:val="ListParagraph"/>
+        <w:numPr>
+          <w:ilvl w:val="0"/>
+          <w:numId w:val="3"/>
+        </w:numPr>
+        <w:spacing w:line="240" w:lineRule="auto"/>
+        <w:rPr>
+          <w:lang w:val="en-US"/>
+        </w:rPr>
+      </w:pPr>
+      <w:r>
+        <w:rPr>
+          <w:lang w:val="en-US"/>
+        </w:rPr>
         <w:t>Specify your folder within the variable ‘</w:t>
       </w:r>
       <w:proofErr w:type="spellStart"/>
@@ -207,14 +308,61 @@
         <w:rPr>
           <w:lang w:val="en-US"/>
         </w:rPr>
-        <w:t>run_model.ipynb</w:t>
+        <w:t>run_</w:t>
+      </w:r>
+      <w:proofErr w:type="gramStart"/>
+      <w:r>
+        <w:rPr>
+          <w:lang w:val="en-US"/>
+        </w:rPr>
+        <w:t>model.ipynb</w:t>
       </w:r>
       <w:proofErr w:type="spellEnd"/>
-      <w:r>
-        <w:rPr>
-          <w:lang w:val="en-US"/>
-        </w:rPr>
-        <w:t>’ file and execute it</w:t>
+      <w:proofErr w:type="gramEnd"/>
+      <w:r>
+        <w:rPr>
+          <w:lang w:val="en-US"/>
+        </w:rPr>
+        <w:t>’ file</w:t>
+      </w:r>
+      <w:r>
+        <w:rPr>
+          <w:lang w:val="en-US"/>
+        </w:rPr>
+        <w:t xml:space="preserve">, and specify the layer names you wish to use in the </w:t>
+      </w:r>
+      <w:proofErr w:type="spellStart"/>
+      <w:r>
+        <w:rPr>
+          <w:lang w:val="en-US"/>
+        </w:rPr>
+        <w:t>layer_names</w:t>
+      </w:r>
+      <w:proofErr w:type="spellEnd"/>
+      <w:r>
+        <w:rPr>
+          <w:lang w:val="en-US"/>
+        </w:rPr>
+        <w:t xml:space="preserve"> variable</w:t>
+      </w:r>
+    </w:p>
+    <w:p>
+      <w:pPr>
+        <w:pStyle w:val="ListParagraph"/>
+        <w:numPr>
+          <w:ilvl w:val="0"/>
+          <w:numId w:val="3"/>
+        </w:numPr>
+        <w:spacing w:line="240" w:lineRule="auto"/>
+        <w:rPr>
+          <w:lang w:val="en-US"/>
+        </w:rPr>
+      </w:pPr>
+      <w:r>
+        <w:rPr>
+          <w:lang w:val="en-US"/>
+        </w:rPr>
+        <w:t>Execute the python file</w:t>
       </w:r>
     </w:p>
     <w:p>
@@ -250,6 +398,7 @@
           <w:lang w:val="en-US"/>
         </w:rPr>
       </w:pPr>
+      <w:proofErr w:type="gramStart"/>
       <w:r>
         <w:rPr>
           <w:b/>
@@ -261,14 +410,25 @@
         <w:rPr>
           <w:lang w:val="en-US"/>
         </w:rPr>
-        <w:t>: ‘TCs.csv’</w:t>
-      </w:r>
-    </w:p>
-    <w:p>
-      <w:pPr>
-        <w:spacing w:line="240" w:lineRule="auto"/>
-        <w:rPr>
-          <w:lang w:val="en-US"/>
+        <w:t>: ‘</w:t>
+      </w:r>
+      <w:proofErr w:type="gramEnd"/>
+      <w:r>
+        <w:rPr>
+          <w:lang w:val="en-US"/>
+        </w:rPr>
+        <w:t>TCs.csv’</w:t>
+      </w:r>
+    </w:p>
+    <w:p>
+      <w:pPr>
+        <w:spacing w:line="240" w:lineRule="auto"/>
+        <w:rPr>
+          <w:rFonts w:ascii="Consolas" w:eastAsia="Times New Roman" w:hAnsi="Consolas" w:cs="Times New Roman"/>
+          <w:color w:val="CCCCCC"/>
+          <w:sz w:val="21"/>
+          <w:szCs w:val="21"/>
+          <w:lang w:val="en-GB" w:eastAsia="en-GB"/>
         </w:rPr>
       </w:pPr>
       <w:r>
@@ -283,6 +443,16 @@
           <w:lang w:val="en-US"/>
         </w:rPr>
         <w:t>:</w:t>
+      </w:r>
+      <w:r>
+        <w:rPr>
+          <w:rFonts w:ascii="Consolas" w:eastAsia="Times New Roman" w:hAnsi="Consolas" w:cs="Times New Roman"/>
+          <w:color w:val="CCCCCC"/>
+          <w:sz w:val="21"/>
+          <w:szCs w:val="21"/>
+          <w:lang w:val="en-GB" w:eastAsia="en-GB"/>
+        </w:rPr>
+        <w:t xml:space="preserve"> </w:t>
       </w:r>
     </w:p>
     <w:p>
@@ -294,22 +464,14 @@
         </w:numPr>
         <w:spacing w:line="240" w:lineRule="auto"/>
         <w:rPr>
-          <w:lang w:val="en-US"/>
-        </w:rPr>
-      </w:pPr>
-      <w:proofErr w:type="spellStart"/>
-      <w:r>
-        <w:rPr>
-          <w:lang w:val="en-US"/>
-        </w:rPr>
-        <w:t>input_flow</w:t>
-      </w:r>
-      <w:proofErr w:type="spellEnd"/>
-      <w:r>
-        <w:rPr>
-          <w:lang w:val="en-US"/>
-        </w:rPr>
-        <w:t>: Stock/Flow ID of the input flow for this TC</w:t>
+          <w:lang w:val="en-GB"/>
+        </w:rPr>
+      </w:pPr>
+      <w:r>
+        <w:rPr>
+          <w:lang w:val="en-GB"/>
+        </w:rPr>
+        <w:t>(Optional) Year: Year to which this TC belongs</w:t>
       </w:r>
     </w:p>
     <w:p>
@@ -321,22 +483,14 @@
         </w:numPr>
         <w:spacing w:line="240" w:lineRule="auto"/>
         <w:rPr>
-          <w:lang w:val="en-US"/>
-        </w:rPr>
-      </w:pPr>
-      <w:proofErr w:type="spellStart"/>
-      <w:r>
-        <w:rPr>
-          <w:lang w:val="en-US"/>
-        </w:rPr>
-        <w:t>input_layer</w:t>
-      </w:r>
-      <w:proofErr w:type="spellEnd"/>
-      <w:r>
-        <w:rPr>
-          <w:lang w:val="en-US"/>
-        </w:rPr>
-        <w:t>: Layer to which the input resource belongs, e.g. product, component, material</w:t>
+          <w:lang w:val="en-GB"/>
+        </w:rPr>
+      </w:pPr>
+      <w:r>
+        <w:rPr>
+          <w:lang w:val="en-GB"/>
+        </w:rPr>
+        <w:t>(Optional) Scenario: Scenario to which this TC belongs</w:t>
       </w:r>
     </w:p>
     <w:p>
@@ -348,22 +502,14 @@
         </w:numPr>
         <w:spacing w:line="240" w:lineRule="auto"/>
         <w:rPr>
-          <w:lang w:val="en-US"/>
-        </w:rPr>
-      </w:pPr>
-      <w:proofErr w:type="spellStart"/>
-      <w:r>
-        <w:rPr>
-          <w:lang w:val="en-US"/>
-        </w:rPr>
-        <w:t>input_layer_key</w:t>
-      </w:r>
-      <w:proofErr w:type="spellEnd"/>
-      <w:r>
-        <w:rPr>
-          <w:lang w:val="en-US"/>
-        </w:rPr>
-        <w:t>: Input resource</w:t>
+          <w:lang w:val="en-GB"/>
+        </w:rPr>
+      </w:pPr>
+      <w:r>
+        <w:rPr>
+          <w:lang w:val="en-GB"/>
+        </w:rPr>
+        <w:t>(Optional) Location: Location to which this TC belongs</w:t>
       </w:r>
     </w:p>
     <w:p>
@@ -383,46 +529,14 @@
         <w:rPr>
           <w:lang w:val="en-US"/>
         </w:rPr>
-        <w:t>input_parent_layer</w:t>
+        <w:t>Input_FlowID</w:t>
       </w:r>
       <w:proofErr w:type="spellEnd"/>
       <w:r>
         <w:rPr>
           <w:lang w:val="en-US"/>
         </w:rPr>
-        <w:t>:</w:t>
-      </w:r>
-      <w:r>
-        <w:rPr>
-          <w:lang w:val="en-US"/>
-        </w:rPr>
-        <w:t xml:space="preserve"> </w:t>
-      </w:r>
-      <w:r>
-        <w:rPr>
-          <w:lang w:val="en-US"/>
-        </w:rPr>
-        <w:t>Parent layer of th</w:t>
-      </w:r>
-      <w:r>
-        <w:rPr>
-          <w:lang w:val="en-US"/>
-        </w:rPr>
-        <w:t xml:space="preserve">e input resource. The parent layer and parent </w:t>
-      </w:r>
-      <w:proofErr w:type="spellStart"/>
-      <w:r>
-        <w:rPr>
-          <w:lang w:val="en-US"/>
-        </w:rPr>
-        <w:t>layler</w:t>
-      </w:r>
-      <w:proofErr w:type="spellEnd"/>
-      <w:r>
-        <w:rPr>
-          <w:lang w:val="en-US"/>
-        </w:rPr>
-        <w:t xml:space="preserve"> key can be left empty, in which case it is assumed that the TC applies regardless of what the input resource is contained within.</w:t>
+        <w:t>: Stock/Flow ID of the input flow for this TC</w:t>
       </w:r>
     </w:p>
     <w:p>
@@ -442,20 +556,20 @@
         <w:rPr>
           <w:lang w:val="en-US"/>
         </w:rPr>
-        <w:t>input_parent_layer_key</w:t>
+        <w:t>I</w:t>
+      </w:r>
+      <w:r>
+        <w:rPr>
+          <w:lang w:val="en-US"/>
+        </w:rPr>
+        <w:t>nput_layer</w:t>
       </w:r>
       <w:proofErr w:type="spellEnd"/>
       <w:r>
         <w:rPr>
           <w:lang w:val="en-US"/>
         </w:rPr>
-        <w:t xml:space="preserve">: </w:t>
-      </w:r>
-      <w:r>
-        <w:rPr>
-          <w:lang w:val="en-US"/>
-        </w:rPr>
-        <w:t>Can be left empty, resource in which the input resource is contained</w:t>
+        <w:t>: Layer to which the input resource belongs, e.g. product, component, material</w:t>
       </w:r>
     </w:p>
     <w:p>
@@ -475,20 +589,20 @@
         <w:rPr>
           <w:lang w:val="en-US"/>
         </w:rPr>
-        <w:t>output_flow</w:t>
+        <w:t>I</w:t>
+      </w:r>
+      <w:r>
+        <w:rPr>
+          <w:lang w:val="en-US"/>
+        </w:rPr>
+        <w:t>nput_layer_key</w:t>
       </w:r>
       <w:proofErr w:type="spellEnd"/>
       <w:r>
         <w:rPr>
           <w:lang w:val="en-US"/>
         </w:rPr>
-        <w:t>:</w:t>
-      </w:r>
-      <w:r>
-        <w:rPr>
-          <w:lang w:val="en-US"/>
-        </w:rPr>
-        <w:t xml:space="preserve"> Stock/Flow ID of the output flow for this TC</w:t>
+        <w:t>: Input resource</w:t>
       </w:r>
     </w:p>
     <w:p>
@@ -508,7 +622,31 @@
         <w:rPr>
           <w:lang w:val="en-US"/>
         </w:rPr>
-        <w:t>output_layer</w:t>
+        <w:t>O</w:t>
+      </w:r>
+      <w:r>
+        <w:rPr>
+          <w:lang w:val="en-US"/>
+        </w:rPr>
+        <w:t>utput_</w:t>
+      </w:r>
+      <w:r>
+        <w:rPr>
+          <w:lang w:val="en-US"/>
+        </w:rPr>
+        <w:t>F</w:t>
+      </w:r>
+      <w:r>
+        <w:rPr>
+          <w:lang w:val="en-US"/>
+        </w:rPr>
+        <w:t>low</w:t>
+      </w:r>
+      <w:r>
+        <w:rPr>
+          <w:lang w:val="en-US"/>
+        </w:rPr>
+        <w:t>ID</w:t>
       </w:r>
       <w:proofErr w:type="spellEnd"/>
       <w:r>
@@ -521,7 +659,7 @@
         <w:rPr>
           <w:lang w:val="en-US"/>
         </w:rPr>
-        <w:t xml:space="preserve"> Layer to which the output resource belongs</w:t>
+        <w:t xml:space="preserve"> Stock/Flow ID of the output flow for this TC</w:t>
       </w:r>
     </w:p>
     <w:p>
@@ -541,20 +679,26 @@
         <w:rPr>
           <w:lang w:val="en-US"/>
         </w:rPr>
-        <w:t>output_target_key</w:t>
+        <w:t>TC_target</w:t>
+      </w:r>
+      <w:r>
+        <w:rPr>
+          <w:lang w:val="en-US"/>
+        </w:rPr>
+        <w:t>_layer</w:t>
       </w:r>
       <w:proofErr w:type="spellEnd"/>
       <w:r>
         <w:rPr>
           <w:lang w:val="en-US"/>
         </w:rPr>
-        <w:t xml:space="preserve">: </w:t>
-      </w:r>
-      <w:r>
-        <w:rPr>
-          <w:lang w:val="en-US"/>
-        </w:rPr>
-        <w:t>Output resource</w:t>
+        <w:t>:</w:t>
+      </w:r>
+      <w:r>
+        <w:rPr>
+          <w:lang w:val="en-US"/>
+        </w:rPr>
+        <w:t xml:space="preserve"> Layer to which the output resource belongs</w:t>
       </w:r>
     </w:p>
     <w:p>
@@ -569,6 +713,45 @@
           <w:lang w:val="en-US"/>
         </w:rPr>
       </w:pPr>
+      <w:proofErr w:type="spellStart"/>
+      <w:r>
+        <w:rPr>
+          <w:lang w:val="en-US"/>
+        </w:rPr>
+        <w:t>TC</w:t>
+      </w:r>
+      <w:r>
+        <w:rPr>
+          <w:lang w:val="en-US"/>
+        </w:rPr>
+        <w:t>_target_key</w:t>
+      </w:r>
+      <w:proofErr w:type="spellEnd"/>
+      <w:r>
+        <w:rPr>
+          <w:lang w:val="en-US"/>
+        </w:rPr>
+        <w:t xml:space="preserve">: </w:t>
+      </w:r>
+      <w:r>
+        <w:rPr>
+          <w:lang w:val="en-US"/>
+        </w:rPr>
+        <w:t>Output resource</w:t>
+      </w:r>
+    </w:p>
+    <w:p>
+      <w:pPr>
+        <w:pStyle w:val="ListParagraph"/>
+        <w:numPr>
+          <w:ilvl w:val="0"/>
+          <w:numId w:val="4"/>
+        </w:numPr>
+        <w:spacing w:line="240" w:lineRule="auto"/>
+        <w:rPr>
+          <w:lang w:val="en-US"/>
+        </w:rPr>
+      </w:pPr>
       <w:r>
         <w:rPr>
           <w:lang w:val="en-US"/>
@@ -609,7 +792,7 @@
           <w:noProof/>
         </w:rPr>
         <w:drawing>
-          <wp:inline distT="0" distB="0" distL="0" distR="0" wp14:anchorId="110BF84A" wp14:editId="4CA0C36B">
+          <wp:inline distT="0" distB="0" distL="0" distR="0" wp14:anchorId="34998630" wp14:editId="00BDB60F">
             <wp:extent cx="5760720" cy="481330"/>
             <wp:effectExtent l="0" t="0" r="0" b="0"/>
             <wp:docPr id="1" name="Picture 1"/>
@@ -723,8 +906,6 @@
           <w:lang w:val="en-US"/>
         </w:rPr>
       </w:pPr>
-      <w:bookmarkStart w:id="0" w:name="_GoBack"/>
-      <w:bookmarkEnd w:id="0"/>
       <w:r>
         <w:rPr>
           <w:b/>
@@ -740,6 +921,7 @@
           <w:lang w:val="en-US"/>
         </w:rPr>
       </w:pPr>
+      <w:proofErr w:type="gramStart"/>
       <w:r>
         <w:rPr>
           <w:b/>
@@ -751,7 +933,14 @@
         <w:rPr>
           <w:lang w:val="en-US"/>
         </w:rPr>
-        <w:t>: ‘composition.csv’</w:t>
+        <w:t>: ‘</w:t>
+      </w:r>
+      <w:proofErr w:type="gramEnd"/>
+      <w:r>
+        <w:rPr>
+          <w:lang w:val="en-US"/>
+        </w:rPr>
+        <w:t>composition.csv’</w:t>
       </w:r>
     </w:p>
     <w:p>
@@ -781,15 +970,28 @@
           <w:ilvl w:val="0"/>
           <w:numId w:val="4"/>
         </w:numPr>
-        <w:rPr>
-          <w:lang w:val="en-US"/>
-        </w:rPr>
-      </w:pPr>
-      <w:r>
-        <w:rPr>
-          <w:lang w:val="en-US"/>
-        </w:rPr>
-        <w:t>Stock/Flow ID: Stock/Flow ID for the flow the material is contained in</w:t>
+        <w:spacing w:line="240" w:lineRule="auto"/>
+        <w:rPr>
+          <w:lang w:val="en-GB"/>
+        </w:rPr>
+      </w:pPr>
+      <w:r>
+        <w:rPr>
+          <w:lang w:val="en-GB"/>
+        </w:rPr>
+        <w:t xml:space="preserve">(Optional) Year: Year to which this </w:t>
+      </w:r>
+      <w:r>
+        <w:rPr>
+          <w:lang w:val="en-GB"/>
+        </w:rPr>
+        <w:t>composition data point</w:t>
+      </w:r>
+      <w:r>
+        <w:rPr>
+          <w:lang w:val="en-GB"/>
+        </w:rPr>
+        <w:t xml:space="preserve"> belongs</w:t>
       </w:r>
     </w:p>
     <w:p>
@@ -799,15 +1001,16 @@
           <w:ilvl w:val="0"/>
           <w:numId w:val="4"/>
         </w:numPr>
-        <w:rPr>
-          <w:lang w:val="en-US"/>
-        </w:rPr>
-      </w:pPr>
-      <w:r>
-        <w:rPr>
-          <w:lang w:val="en-US"/>
-        </w:rPr>
-        <w:t>*layer columns: The next columns have the same names as the layers used in the system, e.g. product, component, material</w:t>
+        <w:spacing w:line="240" w:lineRule="auto"/>
+        <w:rPr>
+          <w:lang w:val="en-GB"/>
+        </w:rPr>
+      </w:pPr>
+      <w:r>
+        <w:rPr>
+          <w:lang w:val="en-GB"/>
+        </w:rPr>
+        <w:t>(Optional) Scenario: Scenario to which this composition data point belongs</w:t>
       </w:r>
     </w:p>
     <w:p>
@@ -817,6 +1020,73 @@
           <w:ilvl w:val="0"/>
           <w:numId w:val="4"/>
         </w:numPr>
+        <w:spacing w:line="240" w:lineRule="auto"/>
+        <w:rPr>
+          <w:lang w:val="en-GB"/>
+        </w:rPr>
+      </w:pPr>
+      <w:r>
+        <w:rPr>
+          <w:lang w:val="en-GB"/>
+        </w:rPr>
+        <w:t>(Optional) Location: Location to which this composition data point belongs</w:t>
+      </w:r>
+    </w:p>
+    <w:p>
+      <w:pPr>
+        <w:pStyle w:val="ListParagraph"/>
+        <w:numPr>
+          <w:ilvl w:val="0"/>
+          <w:numId w:val="4"/>
+        </w:numPr>
+        <w:rPr>
+          <w:lang w:val="en-US"/>
+        </w:rPr>
+      </w:pPr>
+      <w:r>
+        <w:rPr>
+          <w:lang w:val="en-US"/>
+        </w:rPr>
+        <w:t>Stock/ID: Stock/Flow ID for the flow the material is contained in</w:t>
+      </w:r>
+    </w:p>
+    <w:p>
+      <w:pPr>
+        <w:pStyle w:val="ListParagraph"/>
+        <w:numPr>
+          <w:ilvl w:val="0"/>
+          <w:numId w:val="4"/>
+        </w:numPr>
+        <w:rPr>
+          <w:lang w:val="en-US"/>
+        </w:rPr>
+      </w:pPr>
+      <w:r>
+        <w:rPr>
+          <w:lang w:val="en-US"/>
+        </w:rPr>
+        <w:t>Layer 1, Layer 2, Layer 3, Layer 4</w:t>
+      </w:r>
+      <w:r>
+        <w:rPr>
+          <w:lang w:val="en-US"/>
+        </w:rPr>
+        <w:t xml:space="preserve">: </w:t>
+      </w:r>
+      <w:r>
+        <w:rPr>
+          <w:lang w:val="en-US"/>
+        </w:rPr>
+        <w:t>Layer for which this composition data point specifies composition</w:t>
+      </w:r>
+    </w:p>
+    <w:p>
+      <w:pPr>
+        <w:pStyle w:val="ListParagraph"/>
+        <w:numPr>
+          <w:ilvl w:val="0"/>
+          <w:numId w:val="4"/>
+        </w:numPr>
         <w:rPr>
           <w:lang w:val="en-US"/>
         </w:rPr>
@@ -860,7 +1130,7 @@
           <w:lang w:val="en-US"/>
         </w:rPr>
         <w:drawing>
-          <wp:inline distT="0" distB="0" distL="0" distR="0">
+          <wp:inline distT="0" distB="0" distL="0" distR="0" wp14:anchorId="08FE1008" wp14:editId="15B9A753">
             <wp:extent cx="3558540" cy="614022"/>
             <wp:effectExtent l="0" t="0" r="3810" b="0"/>
             <wp:docPr id="4" name="Picture 4"/>
@@ -954,6 +1224,7 @@
           <w:lang w:val="en-US"/>
         </w:rPr>
       </w:pPr>
+      <w:proofErr w:type="gramStart"/>
       <w:r>
         <w:rPr>
           <w:b/>
@@ -965,7 +1236,14 @@
         <w:rPr>
           <w:lang w:val="en-US"/>
         </w:rPr>
-        <w:t>: ‘inputs.csv’</w:t>
+        <w:t>: ‘</w:t>
+      </w:r>
+      <w:proofErr w:type="gramEnd"/>
+      <w:r>
+        <w:rPr>
+          <w:lang w:val="en-US"/>
+        </w:rPr>
+        <w:t>inputs.csv’</w:t>
       </w:r>
     </w:p>
     <w:p>
@@ -1003,7 +1281,7 @@
         <w:rPr>
           <w:lang w:val="en-US"/>
         </w:rPr>
-        <w:t>Stock/Flow ID: Stock/Flow ID for this inflow</w:t>
+        <w:t>Year: Year for this inflow</w:t>
       </w:r>
     </w:p>
     <w:p>
@@ -1017,19 +1295,11 @@
           <w:lang w:val="en-US"/>
         </w:rPr>
       </w:pPr>
-      <w:proofErr w:type="spellStart"/>
-      <w:r>
-        <w:rPr>
-          <w:lang w:val="en-US"/>
-        </w:rPr>
-        <w:t>Substance_main_parent</w:t>
-      </w:r>
-      <w:proofErr w:type="spellEnd"/>
-      <w:r>
-        <w:rPr>
-          <w:lang w:val="en-US"/>
-        </w:rPr>
-        <w:t>: Inflow substance. Must be a substance of the highest level layer, the parent substance.</w:t>
+      <w:r>
+        <w:rPr>
+          <w:lang w:val="en-US"/>
+        </w:rPr>
+        <w:t>Scenario: Relevant scenario for this inflow</w:t>
       </w:r>
     </w:p>
     <w:p>
@@ -1047,103 +1317,7 @@
         <w:rPr>
           <w:lang w:val="en-US"/>
         </w:rPr>
-        <w:t>Value: Amount of this substance contained in the inflow. The model is agnostic to the unit used in this entry, but the same unit must be handled consistently across inflows</w:t>
-      </w:r>
-    </w:p>
-    <w:p>
-      <w:pPr>
-        <w:spacing w:line="240" w:lineRule="auto"/>
-        <w:rPr>
-          <w:b/>
-          <w:sz w:val="28"/>
-          <w:lang w:val="en-US"/>
-        </w:rPr>
-      </w:pPr>
-    </w:p>
-    <w:p>
-      <w:pPr>
-        <w:spacing w:line="240" w:lineRule="auto"/>
-        <w:rPr>
-          <w:b/>
-          <w:sz w:val="28"/>
-          <w:lang w:val="en-US"/>
-        </w:rPr>
-      </w:pPr>
-      <w:r>
-        <w:rPr>
-          <w:b/>
-          <w:sz w:val="28"/>
-          <w:lang w:val="en-US"/>
-        </w:rPr>
-        <w:t>Metadata</w:t>
-      </w:r>
-    </w:p>
-    <w:p>
-      <w:pPr>
-        <w:spacing w:line="240" w:lineRule="auto"/>
-        <w:rPr>
-          <w:lang w:val="en-US"/>
-        </w:rPr>
-      </w:pPr>
-      <w:r>
-        <w:rPr>
-          <w:b/>
-          <w:lang w:val="en-US"/>
-        </w:rPr>
-        <w:t>Filename</w:t>
-      </w:r>
-      <w:r>
-        <w:rPr>
-          <w:lang w:val="en-US"/>
-        </w:rPr>
-        <w:t>: ‘</w:t>
-      </w:r>
-      <w:r>
-        <w:rPr>
-          <w:lang w:val="en-US"/>
-        </w:rPr>
-        <w:t>metadata</w:t>
-      </w:r>
-      <w:r>
-        <w:rPr>
-          <w:lang w:val="en-US"/>
-        </w:rPr>
-        <w:t>.csv’</w:t>
-      </w:r>
-    </w:p>
-    <w:p>
-      <w:pPr>
-        <w:spacing w:line="240" w:lineRule="auto"/>
-        <w:rPr>
-          <w:lang w:val="en-US"/>
-        </w:rPr>
-      </w:pPr>
-      <w:r>
-        <w:rPr>
-          <w:lang w:val="en-US"/>
-        </w:rPr>
-        <w:t>The metadata file informs the model of all the layers, flows and resources that are being used.</w:t>
-      </w:r>
-    </w:p>
-    <w:p>
-      <w:pPr>
-        <w:spacing w:line="240" w:lineRule="auto"/>
-        <w:rPr>
-          <w:lang w:val="en-US"/>
-        </w:rPr>
-      </w:pPr>
-      <w:r>
-        <w:rPr>
-          <w:b/>
-          <w:lang w:val="en-US"/>
-        </w:rPr>
-        <w:t>Columns</w:t>
-      </w:r>
-      <w:r>
-        <w:rPr>
-          <w:lang w:val="en-US"/>
-        </w:rPr>
-        <w:t xml:space="preserve">: </w:t>
+        <w:t>Location: Location for this inflow</w:t>
       </w:r>
     </w:p>
     <w:p>
@@ -1153,16 +1327,15 @@
           <w:ilvl w:val="0"/>
           <w:numId w:val="4"/>
         </w:numPr>
-        <w:spacing w:line="240" w:lineRule="auto"/>
-        <w:rPr>
-          <w:lang w:val="en-US"/>
-        </w:rPr>
-      </w:pPr>
-      <w:r>
-        <w:rPr>
-          <w:lang w:val="en-US"/>
-        </w:rPr>
-        <w:t>Stock/Flow ID: In this columns all available flows are listed</w:t>
+        <w:rPr>
+          <w:lang w:val="en-US"/>
+        </w:rPr>
+      </w:pPr>
+      <w:r>
+        <w:rPr>
+          <w:lang w:val="en-US"/>
+        </w:rPr>
+        <w:t>Stock/Flow ID: Stock/Flow ID for this inflow</w:t>
       </w:r>
     </w:p>
     <w:p>
@@ -1172,100 +1345,55 @@
           <w:ilvl w:val="0"/>
           <w:numId w:val="4"/>
         </w:numPr>
-        <w:spacing w:line="240" w:lineRule="auto"/>
-        <w:rPr>
-          <w:lang w:val="en-US"/>
-        </w:rPr>
-      </w:pPr>
-      <w:r>
-        <w:rPr>
-          <w:lang w:val="en-US"/>
-        </w:rPr>
-        <w:t>*layer columns: In the next columns all of the used layers need to be used as the column names, e.g. product, component, material</w:t>
-      </w:r>
-    </w:p>
-    <w:p>
-      <w:pPr>
-        <w:spacing w:line="240" w:lineRule="auto"/>
-        <w:rPr>
-          <w:lang w:val="en-US"/>
-        </w:rPr>
-      </w:pPr>
-      <w:r>
-        <w:rPr>
-          <w:b/>
-          <w:lang w:val="en-US"/>
-        </w:rPr>
-        <w:t>Example</w:t>
-      </w:r>
-      <w:r>
-        <w:rPr>
-          <w:lang w:val="en-US"/>
-        </w:rPr>
-        <w:t xml:space="preserve">: </w:t>
-      </w:r>
-    </w:p>
-    <w:p>
-      <w:pPr>
-        <w:spacing w:line="240" w:lineRule="auto"/>
-        <w:rPr>
-          <w:lang w:val="en-US"/>
-        </w:rPr>
-      </w:pPr>
-      <w:r>
-        <w:rPr>
-          <w:noProof/>
-        </w:rPr>
-        <w:lastRenderedPageBreak/>
-        <w:drawing>
-          <wp:inline distT="0" distB="0" distL="0" distR="0" wp14:anchorId="2A5347FF" wp14:editId="5FFEE867">
-            <wp:extent cx="2809875" cy="1323975"/>
-            <wp:effectExtent l="0" t="0" r="9525" b="9525"/>
-            <wp:docPr id="7" name="Picture 7"/>
-            <wp:cNvGraphicFramePr>
-              <a:graphicFrameLocks xmlns:a="http://schemas.openxmlformats.org/drawingml/2006/main" noChangeAspect="1"/>
-            </wp:cNvGraphicFramePr>
-            <a:graphic xmlns:a="http://schemas.openxmlformats.org/drawingml/2006/main">
-              <a:graphicData uri="http://schemas.openxmlformats.org/drawingml/2006/picture">
-                <pic:pic xmlns:pic="http://schemas.openxmlformats.org/drawingml/2006/picture">
-                  <pic:nvPicPr>
-                    <pic:cNvPr id="1" name=""/>
-                    <pic:cNvPicPr/>
-                  </pic:nvPicPr>
-                  <pic:blipFill>
-                    <a:blip r:embed="rId8"/>
-                    <a:stretch>
-                      <a:fillRect/>
-                    </a:stretch>
-                  </pic:blipFill>
-                  <pic:spPr>
-                    <a:xfrm>
-                      <a:off x="0" y="0"/>
-                      <a:ext cx="2809875" cy="1323975"/>
-                    </a:xfrm>
-                    <a:prstGeom prst="rect">
-                      <a:avLst/>
-                    </a:prstGeom>
-                  </pic:spPr>
-                </pic:pic>
-              </a:graphicData>
-            </a:graphic>
-          </wp:inline>
-        </w:drawing>
-      </w:r>
-    </w:p>
-    <w:p>
-      <w:pPr>
-        <w:spacing w:line="240" w:lineRule="auto"/>
-        <w:rPr>
-          <w:lang w:val="en-US"/>
-        </w:rPr>
-      </w:pPr>
-      <w:r>
-        <w:rPr>
-          <w:lang w:val="en-US"/>
-        </w:rPr>
-        <w:t>Above metadata file specifies that there are 3 layers in the system: product, component and material. It also defines the names of the 3 flows, 1 product, 2 components and 1 materials that are being used.</w:t>
+        <w:rPr>
+          <w:lang w:val="en-US"/>
+        </w:rPr>
+      </w:pPr>
+      <w:proofErr w:type="spellStart"/>
+      <w:r>
+        <w:rPr>
+          <w:lang w:val="en-US"/>
+        </w:rPr>
+        <w:t>Substance_main_parent</w:t>
+      </w:r>
+      <w:proofErr w:type="spellEnd"/>
+      <w:r>
+        <w:rPr>
+          <w:lang w:val="en-US"/>
+        </w:rPr>
+        <w:t xml:space="preserve">: Inflow substance. Must be a substance of the </w:t>
+      </w:r>
+      <w:proofErr w:type="gramStart"/>
+      <w:r>
+        <w:rPr>
+          <w:lang w:val="en-US"/>
+        </w:rPr>
+        <w:t>highest level</w:t>
+      </w:r>
+      <w:proofErr w:type="gramEnd"/>
+      <w:r>
+        <w:rPr>
+          <w:lang w:val="en-US"/>
+        </w:rPr>
+        <w:t xml:space="preserve"> layer, the parent substance.</w:t>
+      </w:r>
+    </w:p>
+    <w:p>
+      <w:pPr>
+        <w:pStyle w:val="ListParagraph"/>
+        <w:numPr>
+          <w:ilvl w:val="0"/>
+          <w:numId w:val="4"/>
+        </w:numPr>
+        <w:rPr>
+          <w:lang w:val="en-US"/>
+        </w:rPr>
+      </w:pPr>
+      <w:r>
+        <w:rPr>
+          <w:lang w:val="en-US"/>
+        </w:rPr>
+        <w:t>Value: Amount of this substance contained in the inflow. The model is agnostic to the unit used in this entry, but the same unit must be handled consistently across inflows</w:t>
       </w:r>
     </w:p>
     <w:sectPr>
@@ -1279,7 +1407,7 @@
 </file>
 
 <file path=word/numbering.xml><?xml version="1.0" encoding="utf-8"?>
-<w:numbering xmlns:wpc="http://schemas.microsoft.com/office/word/2010/wordprocessingCanvas" xmlns:cx="http://schemas.microsoft.com/office/drawing/2014/chartex" xmlns:cx1="http://schemas.microsoft.com/office/drawing/2015/9/8/chartex" xmlns:cx2="http://schemas.microsoft.com/office/drawing/2015/10/21/chartex" xmlns:cx3="http://schemas.microsoft.com/office/drawing/2016/5/9/chartex" xmlns:cx4="http://schemas.microsoft.com/office/drawing/2016/5/10/chartex" xmlns:cx5="http://schemas.microsoft.com/office/drawing/2016/5/11/chartex" xmlns:cx6="http://schemas.microsoft.com/office/drawing/2016/5/12/chartex" xmlns:cx7="http://schemas.microsoft.com/office/drawing/2016/5/13/chartex" xmlns:cx8="http://schemas.microsoft.com/office/drawing/2016/5/14/chartex" xmlns:mc="http://schemas.openxmlformats.org/markup-compatibility/2006" xmlns:aink="http://schemas.microsoft.com/office/drawing/2016/ink" xmlns:am3d="http://schemas.microsoft.com/office/drawing/2017/model3d" xmlns:o="urn:schemas-microsoft-com:office:office" xmlns:r="http://schemas.openxmlformats.org/officeDocument/2006/relationships" xmlns:m="http://schemas.openxmlformats.org/officeDocument/2006/math" xmlns:v="urn:schemas-microsoft-com:vml" xmlns:wp14="http://schemas.microsoft.com/office/word/2010/wordprocessingDrawing" xmlns:wp="http://schemas.openxmlformats.org/drawingml/2006/wordprocessingDrawing" xmlns:w10="urn:schemas-microsoft-com:office:word" xmlns:w="http://schemas.openxmlformats.org/wordprocessingml/2006/main" xmlns:w14="http://schemas.microsoft.com/office/word/2010/wordml" xmlns:w15="http://schemas.microsoft.com/office/word/2012/wordml" xmlns:w16cid="http://schemas.microsoft.com/office/word/2016/wordml/cid" xmlns:w16se="http://schemas.microsoft.com/office/word/2015/wordml/symex" xmlns:wpg="http://schemas.microsoft.com/office/word/2010/wordprocessingGroup" xmlns:wpi="http://schemas.microsoft.com/office/word/2010/wordprocessingInk" xmlns:wne="http://schemas.microsoft.com/office/word/2006/wordml" xmlns:wps="http://schemas.microsoft.com/office/word/2010/wordprocessingShape" mc:Ignorable="w14 w15 w16se w16cid wp14">
+<w:numbering xmlns:wpc="http://schemas.microsoft.com/office/word/2010/wordprocessingCanvas" xmlns:cx="http://schemas.microsoft.com/office/drawing/2014/chartex" xmlns:cx1="http://schemas.microsoft.com/office/drawing/2015/9/8/chartex" xmlns:cx2="http://schemas.microsoft.com/office/drawing/2015/10/21/chartex" xmlns:cx3="http://schemas.microsoft.com/office/drawing/2016/5/9/chartex" xmlns:cx4="http://schemas.microsoft.com/office/drawing/2016/5/10/chartex" xmlns:cx5="http://schemas.microsoft.com/office/drawing/2016/5/11/chartex" xmlns:cx6="http://schemas.microsoft.com/office/drawing/2016/5/12/chartex" xmlns:cx7="http://schemas.microsoft.com/office/drawing/2016/5/13/chartex" xmlns:cx8="http://schemas.microsoft.com/office/drawing/2016/5/14/chartex" xmlns:mc="http://schemas.openxmlformats.org/markup-compatibility/2006" xmlns:aink="http://schemas.microsoft.com/office/drawing/2016/ink" xmlns:am3d="http://schemas.microsoft.com/office/drawing/2017/model3d" xmlns:o="urn:schemas-microsoft-com:office:office" xmlns:oel="http://schemas.microsoft.com/office/2019/extlst" xmlns:r="http://schemas.openxmlformats.org/officeDocument/2006/relationships" xmlns:m="http://schemas.openxmlformats.org/officeDocument/2006/math" xmlns:v="urn:schemas-microsoft-com:vml" xmlns:wp14="http://schemas.microsoft.com/office/word/2010/wordprocessingDrawing" xmlns:wp="http://schemas.openxmlformats.org/drawingml/2006/wordprocessingDrawing" xmlns:w10="urn:schemas-microsoft-com:office:word" xmlns:w="http://schemas.openxmlformats.org/wordprocessingml/2006/main" xmlns:w14="http://schemas.microsoft.com/office/word/2010/wordml" xmlns:w15="http://schemas.microsoft.com/office/word/2012/wordml" xmlns:w16cex="http://schemas.microsoft.com/office/word/2018/wordml/cex" xmlns:w16cid="http://schemas.microsoft.com/office/word/2016/wordml/cid" xmlns:w16="http://schemas.microsoft.com/office/word/2018/wordml" xmlns:w16du="http://schemas.microsoft.com/office/word/2023/wordml/word16du" xmlns:w16sdtdh="http://schemas.microsoft.com/office/word/2020/wordml/sdtdatahash" xmlns:w16se="http://schemas.microsoft.com/office/word/2015/wordml/symex" xmlns:wpg="http://schemas.microsoft.com/office/word/2010/wordprocessingGroup" xmlns:wpi="http://schemas.microsoft.com/office/word/2010/wordprocessingInk" xmlns:wne="http://schemas.microsoft.com/office/word/2006/wordml" xmlns:wps="http://schemas.microsoft.com/office/word/2010/wordprocessingShape" mc:Ignorable="w14 w15 w16se w16cid w16 w16cex w16sdtdh w16du wp14">
   <w:abstractNum w:abstractNumId="0" w15:restartNumberingAfterBreak="0">
     <w:nsid w:val="241D1F09"/>
     <w:multiLevelType w:val="hybridMultilevel"/>
@@ -1683,23 +1811,23 @@
       </w:pPr>
     </w:lvl>
   </w:abstractNum>
-  <w:num w:numId="1">
+  <w:num w:numId="1" w16cid:durableId="1434352908">
     <w:abstractNumId w:val="0"/>
   </w:num>
-  <w:num w:numId="2">
+  <w:num w:numId="2" w16cid:durableId="1682588480">
     <w:abstractNumId w:val="1"/>
   </w:num>
-  <w:num w:numId="3">
+  <w:num w:numId="3" w16cid:durableId="1303727711">
     <w:abstractNumId w:val="3"/>
   </w:num>
-  <w:num w:numId="4">
+  <w:num w:numId="4" w16cid:durableId="528567127">
     <w:abstractNumId w:val="2"/>
   </w:num>
 </w:numbering>
 </file>
 
 <file path=word/styles.xml><?xml version="1.0" encoding="utf-8"?>
-<w:styles xmlns:mc="http://schemas.openxmlformats.org/markup-compatibility/2006" xmlns:r="http://schemas.openxmlformats.org/officeDocument/2006/relationships" xmlns:w="http://schemas.openxmlformats.org/wordprocessingml/2006/main" xmlns:w14="http://schemas.microsoft.com/office/word/2010/wordml" xmlns:w15="http://schemas.microsoft.com/office/word/2012/wordml" xmlns:w16cid="http://schemas.microsoft.com/office/word/2016/wordml/cid" xmlns:w16se="http://schemas.microsoft.com/office/word/2015/wordml/symex" mc:Ignorable="w14 w15 w16se w16cid">
+<w:styles xmlns:mc="http://schemas.openxmlformats.org/markup-compatibility/2006" xmlns:r="http://schemas.openxmlformats.org/officeDocument/2006/relationships" xmlns:w="http://schemas.openxmlformats.org/wordprocessingml/2006/main" xmlns:w14="http://schemas.microsoft.com/office/word/2010/wordml" xmlns:w15="http://schemas.microsoft.com/office/word/2012/wordml" xmlns:w16cex="http://schemas.microsoft.com/office/word/2018/wordml/cex" xmlns:w16cid="http://schemas.microsoft.com/office/word/2016/wordml/cid" xmlns:w16="http://schemas.microsoft.com/office/word/2018/wordml" xmlns:w16du="http://schemas.microsoft.com/office/word/2023/wordml/word16du" xmlns:w16sdtdh="http://schemas.microsoft.com/office/word/2020/wordml/sdtdatahash" xmlns:w16se="http://schemas.microsoft.com/office/word/2015/wordml/symex" mc:Ignorable="w14 w15 w16se w16cid w16 w16cex w16sdtdh w16du">
   <w:docDefaults>
     <w:rPrDefault>
       <w:rPr>
@@ -1715,7 +1843,7 @@
       </w:pPr>
     </w:pPrDefault>
   </w:docDefaults>
-  <w:latentStyles w:defLockedState="0" w:defUIPriority="99" w:defSemiHidden="0" w:defUnhideWhenUsed="0" w:defQFormat="0" w:count="375">
+  <w:latentStyles w:defLockedState="0" w:defUIPriority="99" w:defSemiHidden="0" w:defUnhideWhenUsed="0" w:defQFormat="0" w:count="376">
     <w:lsdException w:name="Normal" w:uiPriority="0" w:qFormat="1"/>
     <w:lsdException w:name="heading 1" w:uiPriority="9" w:qFormat="1"/>
     <w:lsdException w:name="heading 2" w:semiHidden="1" w:uiPriority="9" w:unhideWhenUsed="1" w:qFormat="1"/>
@@ -2091,6 +2219,7 @@
     <w:lsdException w:name="Smart Hyperlink" w:semiHidden="1" w:unhideWhenUsed="1"/>
     <w:lsdException w:name="Hashtag" w:semiHidden="1" w:unhideWhenUsed="1"/>
     <w:lsdException w:name="Unresolved Mention" w:semiHidden="1" w:unhideWhenUsed="1"/>
+    <w:lsdException w:name="Smart Link" w:semiHidden="1" w:unhideWhenUsed="1"/>
   </w:latentStyles>
   <w:style w:type="paragraph" w:default="1" w:styleId="Normal">
     <w:name w:val="Normal"/>

</xml_diff>

<commit_message>
fix input data issues
</commit_message>
<xml_diff>
--- a/doc/User guide.docx
+++ b/doc/User guide.docx
@@ -1,6 +1,6 @@
 
 <file path=word/document.xml><?xml version="1.0" encoding="utf-8"?>
-<w:document xmlns:wpc="http://schemas.microsoft.com/office/word/2010/wordprocessingCanvas" xmlns:cx="http://schemas.microsoft.com/office/drawing/2014/chartex" xmlns:cx1="http://schemas.microsoft.com/office/drawing/2015/9/8/chartex" xmlns:cx2="http://schemas.microsoft.com/office/drawing/2015/10/21/chartex" xmlns:cx3="http://schemas.microsoft.com/office/drawing/2016/5/9/chartex" xmlns:cx4="http://schemas.microsoft.com/office/drawing/2016/5/10/chartex" xmlns:cx5="http://schemas.microsoft.com/office/drawing/2016/5/11/chartex" xmlns:cx6="http://schemas.microsoft.com/office/drawing/2016/5/12/chartex" xmlns:cx7="http://schemas.microsoft.com/office/drawing/2016/5/13/chartex" xmlns:cx8="http://schemas.microsoft.com/office/drawing/2016/5/14/chartex" xmlns:mc="http://schemas.openxmlformats.org/markup-compatibility/2006" xmlns:aink="http://schemas.microsoft.com/office/drawing/2016/ink" xmlns:am3d="http://schemas.microsoft.com/office/drawing/2017/model3d" xmlns:o="urn:schemas-microsoft-com:office:office" xmlns:oel="http://schemas.microsoft.com/office/2019/extlst" xmlns:r="http://schemas.openxmlformats.org/officeDocument/2006/relationships" xmlns:m="http://schemas.openxmlformats.org/officeDocument/2006/math" xmlns:v="urn:schemas-microsoft-com:vml" xmlns:wp14="http://schemas.microsoft.com/office/word/2010/wordprocessingDrawing" xmlns:wp="http://schemas.openxmlformats.org/drawingml/2006/wordprocessingDrawing" xmlns:w10="urn:schemas-microsoft-com:office:word" xmlns:w="http://schemas.openxmlformats.org/wordprocessingml/2006/main" xmlns:w14="http://schemas.microsoft.com/office/word/2010/wordml" xmlns:w15="http://schemas.microsoft.com/office/word/2012/wordml" xmlns:w16cex="http://schemas.microsoft.com/office/word/2018/wordml/cex" xmlns:w16cid="http://schemas.microsoft.com/office/word/2016/wordml/cid" xmlns:w16="http://schemas.microsoft.com/office/word/2018/wordml" xmlns:w16du="http://schemas.microsoft.com/office/word/2023/wordml/word16du" xmlns:w16sdtdh="http://schemas.microsoft.com/office/word/2020/wordml/sdtdatahash" xmlns:w16se="http://schemas.microsoft.com/office/word/2015/wordml/symex" xmlns:wpg="http://schemas.microsoft.com/office/word/2010/wordprocessingGroup" xmlns:wpi="http://schemas.microsoft.com/office/word/2010/wordprocessingInk" xmlns:wne="http://schemas.microsoft.com/office/word/2006/wordml" xmlns:wps="http://schemas.microsoft.com/office/word/2010/wordprocessingShape" mc:Ignorable="w14 w15 w16se w16cid w16 w16cex w16sdtdh w16du wp14">
+<w:document xmlns:wpc="http://schemas.microsoft.com/office/word/2010/wordprocessingCanvas" xmlns:cx="http://schemas.microsoft.com/office/drawing/2014/chartex" xmlns:cx1="http://schemas.microsoft.com/office/drawing/2015/9/8/chartex" xmlns:cx2="http://schemas.microsoft.com/office/drawing/2015/10/21/chartex" xmlns:cx3="http://schemas.microsoft.com/office/drawing/2016/5/9/chartex" xmlns:cx4="http://schemas.microsoft.com/office/drawing/2016/5/10/chartex" xmlns:cx5="http://schemas.microsoft.com/office/drawing/2016/5/11/chartex" xmlns:cx6="http://schemas.microsoft.com/office/drawing/2016/5/12/chartex" xmlns:cx7="http://schemas.microsoft.com/office/drawing/2016/5/13/chartex" xmlns:cx8="http://schemas.microsoft.com/office/drawing/2016/5/14/chartex" xmlns:mc="http://schemas.openxmlformats.org/markup-compatibility/2006" xmlns:aink="http://schemas.microsoft.com/office/drawing/2016/ink" xmlns:am3d="http://schemas.microsoft.com/office/drawing/2017/model3d" xmlns:o="urn:schemas-microsoft-com:office:office" xmlns:oel="http://schemas.microsoft.com/office/2019/extlst" xmlns:r="http://schemas.openxmlformats.org/officeDocument/2006/relationships" xmlns:m="http://schemas.openxmlformats.org/officeDocument/2006/math" xmlns:v="urn:schemas-microsoft-com:vml" xmlns:wp14="http://schemas.microsoft.com/office/word/2010/wordprocessingDrawing" xmlns:wp="http://schemas.openxmlformats.org/drawingml/2006/wordprocessingDrawing" xmlns:w10="urn:schemas-microsoft-com:office:word" xmlns:w="http://schemas.openxmlformats.org/wordprocessingml/2006/main" xmlns:w14="http://schemas.microsoft.com/office/word/2010/wordml" xmlns:w15="http://schemas.microsoft.com/office/word/2012/wordml" xmlns:w16cex="http://schemas.microsoft.com/office/word/2018/wordml/cex" xmlns:w16cid="http://schemas.microsoft.com/office/word/2016/wordml/cid" xmlns:w16="http://schemas.microsoft.com/office/word/2018/wordml" xmlns:w16du="http://schemas.microsoft.com/office/word/2023/wordml/word16du" xmlns:w16sdtdh="http://schemas.microsoft.com/office/word/2020/wordml/sdtdatahash" xmlns:w16sdtfl="http://schemas.microsoft.com/office/word/2024/wordml/sdtformatlock" xmlns:w16se="http://schemas.microsoft.com/office/word/2015/wordml/symex" xmlns:wpg="http://schemas.microsoft.com/office/word/2010/wordprocessingGroup" xmlns:wpi="http://schemas.microsoft.com/office/word/2010/wordprocessingInk" xmlns:wne="http://schemas.microsoft.com/office/word/2006/wordml" xmlns:wps="http://schemas.microsoft.com/office/word/2010/wordprocessingShape" mc:Ignorable="w14 w15 w16se w16cid w16 w16cex w16sdtdh w16sdtfl w16du wp14">
   <w:body>
     <w:p>
       <w:pPr>
@@ -191,21 +191,7 @@
         <w:rPr>
           <w:lang w:val="en-US"/>
         </w:rPr>
-        <w:t>Create a folder for your data, and create a sub-folder called ‘</w:t>
-      </w:r>
-      <w:proofErr w:type="spellStart"/>
-      <w:r>
-        <w:rPr>
-          <w:lang w:val="en-US"/>
-        </w:rPr>
-        <w:t>input_data</w:t>
-      </w:r>
-      <w:proofErr w:type="spellEnd"/>
-      <w:r>
-        <w:rPr>
-          <w:lang w:val="en-US"/>
-        </w:rPr>
-        <w:t>’.</w:t>
+        <w:t>Create a folder for your data, and create a sub-folder called ‘input_data’.</w:t>
       </w:r>
     </w:p>
     <w:p>
@@ -242,21 +228,7 @@
         <w:rPr>
           <w:lang w:val="en-US"/>
         </w:rPr>
-        <w:t>‘</w:t>
-      </w:r>
-      <w:proofErr w:type="spellStart"/>
-      <w:r>
-        <w:rPr>
-          <w:lang w:val="en-US"/>
-        </w:rPr>
-        <w:t>input_data</w:t>
-      </w:r>
-      <w:proofErr w:type="spellEnd"/>
-      <w:r>
-        <w:rPr>
-          <w:lang w:val="en-US"/>
-        </w:rPr>
-        <w:t>’</w:t>
+        <w:t>‘input_data’</w:t>
       </w:r>
       <w:r>
         <w:rPr>
@@ -287,55 +259,13 @@
         <w:rPr>
           <w:lang w:val="en-US"/>
         </w:rPr>
-        <w:t>Specify your folder within the variable ‘</w:t>
-      </w:r>
-      <w:proofErr w:type="spellStart"/>
-      <w:r>
-        <w:rPr>
-          <w:lang w:val="en-US"/>
-        </w:rPr>
-        <w:t>data_folder</w:t>
-      </w:r>
-      <w:proofErr w:type="spellEnd"/>
-      <w:r>
-        <w:rPr>
-          <w:lang w:val="en-US"/>
-        </w:rPr>
-        <w:t>’ in either the ‘run_model.py’ or ‘</w:t>
-      </w:r>
-      <w:proofErr w:type="spellStart"/>
-      <w:r>
-        <w:rPr>
-          <w:lang w:val="en-US"/>
-        </w:rPr>
-        <w:t>run_model.ipynb</w:t>
-      </w:r>
-      <w:proofErr w:type="spellEnd"/>
-      <w:r>
-        <w:rPr>
-          <w:lang w:val="en-US"/>
-        </w:rPr>
-        <w:t>’ file</w:t>
-      </w:r>
-      <w:r>
-        <w:rPr>
-          <w:lang w:val="en-US"/>
-        </w:rPr>
-        <w:t xml:space="preserve">, and specify the layer names you wish to use in the </w:t>
-      </w:r>
-      <w:proofErr w:type="spellStart"/>
-      <w:r>
-        <w:rPr>
-          <w:lang w:val="en-US"/>
-        </w:rPr>
-        <w:t>layer_names</w:t>
-      </w:r>
-      <w:proofErr w:type="spellEnd"/>
-      <w:r>
-        <w:rPr>
-          <w:lang w:val="en-US"/>
-        </w:rPr>
-        <w:t xml:space="preserve"> variable</w:t>
+        <w:t xml:space="preserve">Go to the ‘run_model.py’ file, and modify the variable ‘data_folder’  </w:t>
+      </w:r>
+      <w:r>
+        <w:rPr>
+          <w:lang w:val="en-US"/>
+        </w:rPr>
+        <w:t>to specify the path to your data. If your layer names are different from ‘product’,’component’, ‘material’ and ‘element’, specify the layers used.</w:t>
       </w:r>
     </w:p>
     <w:p>
@@ -355,6 +285,20 @@
           <w:lang w:val="en-US"/>
         </w:rPr>
         <w:t>Execute the python file</w:t>
+      </w:r>
+    </w:p>
+    <w:p>
+      <w:pPr>
+        <w:spacing w:line="240" w:lineRule="auto"/>
+        <w:rPr>
+          <w:lang w:val="en-US"/>
+        </w:rPr>
+      </w:pPr>
+      <w:r>
+        <w:rPr>
+          <w:lang w:val="en-US"/>
+        </w:rPr>
+        <w:t>Below is an outline of the input format required for the TCs, compositions and inflows.</w:t>
       </w:r>
     </w:p>
     <w:p>
@@ -505,17 +449,34 @@
         </w:numPr>
         <w:spacing w:line="240" w:lineRule="auto"/>
         <w:rPr>
-          <w:lang w:val="en-US"/>
-        </w:rPr>
-      </w:pPr>
-      <w:proofErr w:type="spellStart"/>
+          <w:lang w:val="en-GB"/>
+        </w:rPr>
+      </w:pPr>
+      <w:r>
+        <w:rPr>
+          <w:lang w:val="en-GB"/>
+        </w:rPr>
+        <w:t>(Optional) additionalSpecification: additionalSpecification for this TC</w:t>
+      </w:r>
+    </w:p>
+    <w:p>
+      <w:pPr>
+        <w:pStyle w:val="ListParagraph"/>
+        <w:numPr>
+          <w:ilvl w:val="0"/>
+          <w:numId w:val="4"/>
+        </w:numPr>
+        <w:spacing w:line="240" w:lineRule="auto"/>
+        <w:rPr>
+          <w:lang w:val="en-US"/>
+        </w:rPr>
+      </w:pPr>
       <w:r>
         <w:rPr>
           <w:lang w:val="en-US"/>
         </w:rPr>
         <w:t>Input_FlowID</w:t>
       </w:r>
-      <w:proofErr w:type="spellEnd"/>
       <w:r>
         <w:rPr>
           <w:lang w:val="en-US"/>
@@ -535,7 +496,6 @@
           <w:lang w:val="en-US"/>
         </w:rPr>
       </w:pPr>
-      <w:proofErr w:type="spellStart"/>
       <w:r>
         <w:rPr>
           <w:lang w:val="en-US"/>
@@ -546,14 +506,7 @@
         <w:rPr>
           <w:lang w:val="en-US"/>
         </w:rPr>
-        <w:t>nput_layer</w:t>
-      </w:r>
-      <w:proofErr w:type="spellEnd"/>
-      <w:r>
-        <w:rPr>
-          <w:lang w:val="en-US"/>
-        </w:rPr>
-        <w:t>: Layer to which the input resource belongs, e.g. product, component, material</w:t>
+        <w:t>nput_layer: Layer to which the input resource belongs, e.g. product, component, material</w:t>
       </w:r>
     </w:p>
     <w:p>
@@ -568,7 +521,6 @@
           <w:lang w:val="en-US"/>
         </w:rPr>
       </w:pPr>
-      <w:proofErr w:type="spellStart"/>
       <w:r>
         <w:rPr>
           <w:lang w:val="en-US"/>
@@ -579,14 +531,7 @@
         <w:rPr>
           <w:lang w:val="en-US"/>
         </w:rPr>
-        <w:t>nput_layer_key</w:t>
-      </w:r>
-      <w:proofErr w:type="spellEnd"/>
-      <w:r>
-        <w:rPr>
-          <w:lang w:val="en-US"/>
-        </w:rPr>
-        <w:t>: Input resource</w:t>
+        <w:t>nput_layer_key: Input resource</w:t>
       </w:r>
     </w:p>
     <w:p>
@@ -601,7 +546,6 @@
           <w:lang w:val="en-US"/>
         </w:rPr>
       </w:pPr>
-      <w:proofErr w:type="spellStart"/>
       <w:r>
         <w:rPr>
           <w:lang w:val="en-US"/>
@@ -632,7 +576,6 @@
         </w:rPr>
         <w:t>ID</w:t>
       </w:r>
-      <w:proofErr w:type="spellEnd"/>
       <w:r>
         <w:rPr>
           <w:lang w:val="en-US"/>
@@ -658,7 +601,6 @@
           <w:lang w:val="en-US"/>
         </w:rPr>
       </w:pPr>
-      <w:proofErr w:type="spellStart"/>
       <w:r>
         <w:rPr>
           <w:lang w:val="en-US"/>
@@ -669,14 +611,7 @@
         <w:rPr>
           <w:lang w:val="en-US"/>
         </w:rPr>
-        <w:t>_layer</w:t>
-      </w:r>
-      <w:proofErr w:type="spellEnd"/>
-      <w:r>
-        <w:rPr>
-          <w:lang w:val="en-US"/>
-        </w:rPr>
-        <w:t>:</w:t>
+        <w:t>_layer:</w:t>
       </w:r>
       <w:r>
         <w:rPr>
@@ -697,7 +632,6 @@
           <w:lang w:val="en-US"/>
         </w:rPr>
       </w:pPr>
-      <w:proofErr w:type="spellStart"/>
       <w:r>
         <w:rPr>
           <w:lang w:val="en-US"/>
@@ -708,71 +642,65 @@
         <w:rPr>
           <w:lang w:val="en-US"/>
         </w:rPr>
-        <w:t>_target_key</w:t>
-      </w:r>
-      <w:proofErr w:type="spellEnd"/>
+        <w:t xml:space="preserve">_target_key: </w:t>
+      </w:r>
+      <w:r>
+        <w:rPr>
+          <w:lang w:val="en-US"/>
+        </w:rPr>
+        <w:t>Output resource</w:t>
+      </w:r>
+    </w:p>
+    <w:p>
+      <w:pPr>
+        <w:pStyle w:val="ListParagraph"/>
+        <w:numPr>
+          <w:ilvl w:val="0"/>
+          <w:numId w:val="4"/>
+        </w:numPr>
+        <w:spacing w:line="240" w:lineRule="auto"/>
+        <w:rPr>
+          <w:lang w:val="en-US"/>
+        </w:rPr>
+      </w:pPr>
+      <w:r>
+        <w:rPr>
+          <w:lang w:val="en-US"/>
+        </w:rPr>
+        <w:t>value: Value of the TC</w:t>
+      </w:r>
+    </w:p>
+    <w:p>
+      <w:pPr>
+        <w:spacing w:line="240" w:lineRule="auto"/>
+        <w:rPr>
+          <w:lang w:val="en-US"/>
+        </w:rPr>
+      </w:pPr>
+      <w:r>
+        <w:rPr>
+          <w:b/>
+          <w:lang w:val="en-US"/>
+        </w:rPr>
+        <w:t>Example</w:t>
+      </w:r>
       <w:r>
         <w:rPr>
           <w:lang w:val="en-US"/>
         </w:rPr>
         <w:t xml:space="preserve">: </w:t>
       </w:r>
-      <w:r>
-        <w:rPr>
-          <w:lang w:val="en-US"/>
-        </w:rPr>
-        <w:t>Output resource</w:t>
-      </w:r>
-    </w:p>
-    <w:p>
-      <w:pPr>
-        <w:pStyle w:val="ListParagraph"/>
-        <w:numPr>
-          <w:ilvl w:val="0"/>
-          <w:numId w:val="4"/>
-        </w:numPr>
-        <w:spacing w:line="240" w:lineRule="auto"/>
-        <w:rPr>
-          <w:lang w:val="en-US"/>
-        </w:rPr>
-      </w:pPr>
-      <w:r>
-        <w:rPr>
-          <w:lang w:val="en-US"/>
-        </w:rPr>
-        <w:t>value: Value of the TC</w:t>
-      </w:r>
-    </w:p>
-    <w:p>
-      <w:pPr>
-        <w:spacing w:line="240" w:lineRule="auto"/>
-        <w:rPr>
-          <w:lang w:val="en-US"/>
-        </w:rPr>
-      </w:pPr>
-      <w:r>
-        <w:rPr>
-          <w:b/>
-          <w:lang w:val="en-US"/>
-        </w:rPr>
-        <w:t>Example</w:t>
-      </w:r>
-      <w:r>
-        <w:rPr>
-          <w:lang w:val="en-US"/>
-        </w:rPr>
-        <w:t xml:space="preserve">: </w:t>
-      </w:r>
-    </w:p>
-    <w:p>
-      <w:pPr>
-        <w:spacing w:line="240" w:lineRule="auto"/>
-        <w:rPr>
-          <w:lang w:val="en-US"/>
-        </w:rPr>
-      </w:pPr>
-      <w:r>
-        <w:rPr>
+    </w:p>
+    <w:p>
+      <w:pPr>
+        <w:spacing w:line="240" w:lineRule="auto"/>
+        <w:rPr>
+          <w:lang w:val="en-US"/>
+        </w:rPr>
+      </w:pPr>
+      <w:r>
+        <w:rPr>
+          <w:noProof/>
           <w:lang w:val="en-US"/>
         </w:rPr>
         <w:drawing>
@@ -823,6 +751,7 @@
         <w:rPr>
           <w:lang w:val="en-US"/>
         </w:rPr>
+        <w:lastRenderedPageBreak/>
         <w:t>Above entry to the TC</w:t>
       </w:r>
       <w:r>
@@ -893,7 +822,6 @@
           <w:bCs/>
           <w:lang w:val="en-US"/>
         </w:rPr>
-        <w:lastRenderedPageBreak/>
         <w:t>NOTE</w:t>
       </w:r>
       <w:r>
@@ -1055,6 +983,31 @@
           <w:ilvl w:val="0"/>
           <w:numId w:val="4"/>
         </w:numPr>
+        <w:spacing w:line="240" w:lineRule="auto"/>
+        <w:rPr>
+          <w:lang w:val="en-GB"/>
+        </w:rPr>
+      </w:pPr>
+      <w:r>
+        <w:rPr>
+          <w:lang w:val="en-GB"/>
+        </w:rPr>
+        <w:t xml:space="preserve">(Optional) additionalSpecification: additionalSpecification for this </w:t>
+      </w:r>
+      <w:r>
+        <w:rPr>
+          <w:lang w:val="en-GB"/>
+        </w:rPr>
+        <w:t>data point</w:t>
+      </w:r>
+    </w:p>
+    <w:p>
+      <w:pPr>
+        <w:pStyle w:val="ListParagraph"/>
+        <w:numPr>
+          <w:ilvl w:val="0"/>
+          <w:numId w:val="4"/>
+        </w:numPr>
         <w:rPr>
           <w:lang w:val="en-US"/>
         </w:rPr>
@@ -1142,6 +1095,7 @@
       </w:pPr>
       <w:r>
         <w:rPr>
+          <w:noProof/>
           <w:lang w:val="en-US"/>
         </w:rPr>
         <w:drawing>
@@ -1342,6 +1296,32 @@
           <w:ilvl w:val="0"/>
           <w:numId w:val="4"/>
         </w:numPr>
+        <w:spacing w:line="240" w:lineRule="auto"/>
+        <w:rPr>
+          <w:lang w:val="en-US"/>
+        </w:rPr>
+      </w:pPr>
+      <w:r>
+        <w:rPr>
+          <w:lang w:val="en-GB"/>
+        </w:rPr>
+        <w:t xml:space="preserve">(Optional) additionalSpecification: additionalSpecification for this </w:t>
+      </w:r>
+      <w:r>
+        <w:rPr>
+          <w:lang w:val="en-GB"/>
+        </w:rPr>
+        <w:t>inflow</w:t>
+      </w:r>
+    </w:p>
+    <w:p>
+      <w:pPr>
+        <w:pStyle w:val="ListParagraph"/>
+        <w:numPr>
+          <w:ilvl w:val="0"/>
+          <w:numId w:val="4"/>
+        </w:numPr>
+        <w:spacing w:line="240" w:lineRule="auto"/>
         <w:rPr>
           <w:lang w:val="en-US"/>
         </w:rPr>
@@ -1364,19 +1344,11 @@
           <w:lang w:val="en-US"/>
         </w:rPr>
       </w:pPr>
-      <w:proofErr w:type="spellStart"/>
-      <w:r>
-        <w:rPr>
-          <w:lang w:val="en-US"/>
-        </w:rPr>
-        <w:t>Substance_main_parent</w:t>
-      </w:r>
-      <w:proofErr w:type="spellEnd"/>
-      <w:r>
-        <w:rPr>
-          <w:lang w:val="en-US"/>
-        </w:rPr>
-        <w:t>: Inflow substance. Must be a substance of the highest level layer, the parent substance.</w:t>
+      <w:r>
+        <w:rPr>
+          <w:lang w:val="en-US"/>
+        </w:rPr>
+        <w:t>Substance_main_parent: Inflow substance. Must be a substance of the highest level layer, the parent substance.</w:t>
       </w:r>
     </w:p>
     <w:p>
@@ -1415,7 +1387,43 @@
         <w:rPr>
           <w:lang w:val="en-US"/>
         </w:rPr>
-        <w:t>The inflows file is leading for the model to choose which years, scenarios and locations will be analyzed. Specifying these is optional, you can specify some or all of these columns. If a specific year/scenario/location is specified in the inflows file, the model will search for these same years/scenarios/locations in the TCs and composition files and use these if they are present. If these are not present in the TCs or composition files, we assume that the TCs and composition files are the same for all years/scenarios/locations.</w:t>
+        <w:t>The inflows file is leading for the model to choose which years, scenarios</w:t>
+      </w:r>
+      <w:r>
+        <w:rPr>
+          <w:lang w:val="en-US"/>
+        </w:rPr>
+        <w:t xml:space="preserve">, locations and additionalSpecification </w:t>
+      </w:r>
+      <w:r>
+        <w:rPr>
+          <w:lang w:val="en-US"/>
+        </w:rPr>
+        <w:t>will be analyzed. Specifying these is optional, you can specify some or all of these columns. If a specific year/scenario</w:t>
+      </w:r>
+      <w:r>
+        <w:rPr>
+          <w:lang w:val="en-US"/>
+        </w:rPr>
+        <w:t>/..</w:t>
+      </w:r>
+      <w:r>
+        <w:rPr>
+          <w:lang w:val="en-US"/>
+        </w:rPr>
+        <w:t xml:space="preserve"> is specified in the inflows file, the model will search for these same years/scenarios</w:t>
+      </w:r>
+      <w:r>
+        <w:rPr>
+          <w:lang w:val="en-US"/>
+        </w:rPr>
+        <w:t>/..</w:t>
+      </w:r>
+      <w:r>
+        <w:rPr>
+          <w:lang w:val="en-US"/>
+        </w:rPr>
+        <w:t xml:space="preserve"> in the TCs and composition files and use these if they are present. If these are not present in the TCs or composition files, we assume that the TCs and composition files are the same for all years/scenarios/locations.</w:t>
       </w:r>
     </w:p>
     <w:sectPr>
@@ -1429,7 +1437,7 @@
 </file>
 
 <file path=word/numbering.xml><?xml version="1.0" encoding="utf-8"?>
-<w:numbering xmlns:wpc="http://schemas.microsoft.com/office/word/2010/wordprocessingCanvas" xmlns:cx="http://schemas.microsoft.com/office/drawing/2014/chartex" xmlns:cx1="http://schemas.microsoft.com/office/drawing/2015/9/8/chartex" xmlns:cx2="http://schemas.microsoft.com/office/drawing/2015/10/21/chartex" xmlns:cx3="http://schemas.microsoft.com/office/drawing/2016/5/9/chartex" xmlns:cx4="http://schemas.microsoft.com/office/drawing/2016/5/10/chartex" xmlns:cx5="http://schemas.microsoft.com/office/drawing/2016/5/11/chartex" xmlns:cx6="http://schemas.microsoft.com/office/drawing/2016/5/12/chartex" xmlns:cx7="http://schemas.microsoft.com/office/drawing/2016/5/13/chartex" xmlns:cx8="http://schemas.microsoft.com/office/drawing/2016/5/14/chartex" xmlns:mc="http://schemas.openxmlformats.org/markup-compatibility/2006" xmlns:aink="http://schemas.microsoft.com/office/drawing/2016/ink" xmlns:am3d="http://schemas.microsoft.com/office/drawing/2017/model3d" xmlns:o="urn:schemas-microsoft-com:office:office" xmlns:oel="http://schemas.microsoft.com/office/2019/extlst" xmlns:r="http://schemas.openxmlformats.org/officeDocument/2006/relationships" xmlns:m="http://schemas.openxmlformats.org/officeDocument/2006/math" xmlns:v="urn:schemas-microsoft-com:vml" xmlns:wp14="http://schemas.microsoft.com/office/word/2010/wordprocessingDrawing" xmlns:wp="http://schemas.openxmlformats.org/drawingml/2006/wordprocessingDrawing" xmlns:w10="urn:schemas-microsoft-com:office:word" xmlns:w="http://schemas.openxmlformats.org/wordprocessingml/2006/main" xmlns:w14="http://schemas.microsoft.com/office/word/2010/wordml" xmlns:w15="http://schemas.microsoft.com/office/word/2012/wordml" xmlns:w16cex="http://schemas.microsoft.com/office/word/2018/wordml/cex" xmlns:w16cid="http://schemas.microsoft.com/office/word/2016/wordml/cid" xmlns:w16="http://schemas.microsoft.com/office/word/2018/wordml" xmlns:w16du="http://schemas.microsoft.com/office/word/2023/wordml/word16du" xmlns:w16sdtdh="http://schemas.microsoft.com/office/word/2020/wordml/sdtdatahash" xmlns:w16se="http://schemas.microsoft.com/office/word/2015/wordml/symex" xmlns:wpg="http://schemas.microsoft.com/office/word/2010/wordprocessingGroup" xmlns:wpi="http://schemas.microsoft.com/office/word/2010/wordprocessingInk" xmlns:wne="http://schemas.microsoft.com/office/word/2006/wordml" xmlns:wps="http://schemas.microsoft.com/office/word/2010/wordprocessingShape" mc:Ignorable="w14 w15 w16se w16cid w16 w16cex w16sdtdh w16du wp14">
+<w:numbering xmlns:wpc="http://schemas.microsoft.com/office/word/2010/wordprocessingCanvas" xmlns:cx="http://schemas.microsoft.com/office/drawing/2014/chartex" xmlns:cx1="http://schemas.microsoft.com/office/drawing/2015/9/8/chartex" xmlns:cx2="http://schemas.microsoft.com/office/drawing/2015/10/21/chartex" xmlns:cx3="http://schemas.microsoft.com/office/drawing/2016/5/9/chartex" xmlns:cx4="http://schemas.microsoft.com/office/drawing/2016/5/10/chartex" xmlns:cx5="http://schemas.microsoft.com/office/drawing/2016/5/11/chartex" xmlns:cx6="http://schemas.microsoft.com/office/drawing/2016/5/12/chartex" xmlns:cx7="http://schemas.microsoft.com/office/drawing/2016/5/13/chartex" xmlns:cx8="http://schemas.microsoft.com/office/drawing/2016/5/14/chartex" xmlns:mc="http://schemas.openxmlformats.org/markup-compatibility/2006" xmlns:aink="http://schemas.microsoft.com/office/drawing/2016/ink" xmlns:am3d="http://schemas.microsoft.com/office/drawing/2017/model3d" xmlns:o="urn:schemas-microsoft-com:office:office" xmlns:oel="http://schemas.microsoft.com/office/2019/extlst" xmlns:r="http://schemas.openxmlformats.org/officeDocument/2006/relationships" xmlns:m="http://schemas.openxmlformats.org/officeDocument/2006/math" xmlns:v="urn:schemas-microsoft-com:vml" xmlns:wp14="http://schemas.microsoft.com/office/word/2010/wordprocessingDrawing" xmlns:wp="http://schemas.openxmlformats.org/drawingml/2006/wordprocessingDrawing" xmlns:w10="urn:schemas-microsoft-com:office:word" xmlns:w="http://schemas.openxmlformats.org/wordprocessingml/2006/main" xmlns:w14="http://schemas.microsoft.com/office/word/2010/wordml" xmlns:w15="http://schemas.microsoft.com/office/word/2012/wordml" xmlns:w16cex="http://schemas.microsoft.com/office/word/2018/wordml/cex" xmlns:w16cid="http://schemas.microsoft.com/office/word/2016/wordml/cid" xmlns:w16="http://schemas.microsoft.com/office/word/2018/wordml" xmlns:w16du="http://schemas.microsoft.com/office/word/2023/wordml/word16du" xmlns:w16sdtdh="http://schemas.microsoft.com/office/word/2020/wordml/sdtdatahash" xmlns:w16sdtfl="http://schemas.microsoft.com/office/word/2024/wordml/sdtformatlock" xmlns:w16se="http://schemas.microsoft.com/office/word/2015/wordml/symex" xmlns:wpg="http://schemas.microsoft.com/office/word/2010/wordprocessingGroup" xmlns:wpi="http://schemas.microsoft.com/office/word/2010/wordprocessingInk" xmlns:wne="http://schemas.microsoft.com/office/word/2006/wordml" xmlns:wps="http://schemas.microsoft.com/office/word/2010/wordprocessingShape" mc:Ignorable="w14 w15 w16se w16cid w16 w16cex w16sdtdh w16sdtfl w16du wp14">
   <w:abstractNum w:abstractNumId="0" w15:restartNumberingAfterBreak="0">
     <w:nsid w:val="241D1F09"/>
     <w:multiLevelType w:val="hybridMultilevel"/>
@@ -1849,7 +1857,7 @@
 </file>
 
 <file path=word/styles.xml><?xml version="1.0" encoding="utf-8"?>
-<w:styles xmlns:mc="http://schemas.openxmlformats.org/markup-compatibility/2006" xmlns:r="http://schemas.openxmlformats.org/officeDocument/2006/relationships" xmlns:w="http://schemas.openxmlformats.org/wordprocessingml/2006/main" xmlns:w14="http://schemas.microsoft.com/office/word/2010/wordml" xmlns:w15="http://schemas.microsoft.com/office/word/2012/wordml" xmlns:w16cex="http://schemas.microsoft.com/office/word/2018/wordml/cex" xmlns:w16cid="http://schemas.microsoft.com/office/word/2016/wordml/cid" xmlns:w16="http://schemas.microsoft.com/office/word/2018/wordml" xmlns:w16du="http://schemas.microsoft.com/office/word/2023/wordml/word16du" xmlns:w16sdtdh="http://schemas.microsoft.com/office/word/2020/wordml/sdtdatahash" xmlns:w16se="http://schemas.microsoft.com/office/word/2015/wordml/symex" mc:Ignorable="w14 w15 w16se w16cid w16 w16cex w16sdtdh w16du">
+<w:styles xmlns:mc="http://schemas.openxmlformats.org/markup-compatibility/2006" xmlns:r="http://schemas.openxmlformats.org/officeDocument/2006/relationships" xmlns:w="http://schemas.openxmlformats.org/wordprocessingml/2006/main" xmlns:w14="http://schemas.microsoft.com/office/word/2010/wordml" xmlns:w15="http://schemas.microsoft.com/office/word/2012/wordml" xmlns:w16cex="http://schemas.microsoft.com/office/word/2018/wordml/cex" xmlns:w16cid="http://schemas.microsoft.com/office/word/2016/wordml/cid" xmlns:w16="http://schemas.microsoft.com/office/word/2018/wordml" xmlns:w16du="http://schemas.microsoft.com/office/word/2023/wordml/word16du" xmlns:w16sdtdh="http://schemas.microsoft.com/office/word/2020/wordml/sdtdatahash" xmlns:w16sdtfl="http://schemas.microsoft.com/office/word/2024/wordml/sdtformatlock" xmlns:w16se="http://schemas.microsoft.com/office/word/2015/wordml/symex" mc:Ignorable="w14 w15 w16se w16cid w16 w16cex w16sdtdh w16sdtfl w16du">
   <w:docDefaults>
     <w:rPrDefault>
       <w:rPr>

</xml_diff>